<commit_message>
Đề 1: apply 3 D5 fixes + image sources; Đề 2: add D3 prompt with clean ngữ liệu
- Fix 1: Câu 1 A thêm "hằng số cân bằng", D bỏ "vừa" (cân bằng độ dài)
- Fix 2: Câu 3 C thêm "vẫn giữ nguyên," (cân bằng độ dài)
- Fix 3: Câu 5 Cột B ý a mở rộng "sự khác nhau về số mũ và số lượng nồng độ"
- Remove câu 5,6,7 (giữ 6 câu: gốc 1,2,3,4,8,9)
- Add image source captions: H1 Shutterstock, H2 P20 STUDY
- New: Đề 2 D3 prompt with 7-ý ngữ liệu (10 A1/style fixes applied), L1-L5, matrix 15 câu

Co-Authored-By: Claude Opus 4.6 <noreply@anthropic.com>
Claude-Session: https://claude.ai/code/session_01YToDWK6Q41xkdnJbBz9Sbt
</commit_message>
<xml_diff>
--- a/Can bang hoa hoc/Buoi 3/Buổi 3. [SOURCE] Đề 1 - Khi Le Chatelier đoán sai.docx
+++ b/Can bang hoa hoc/Buoi 3/Buổi 3. [SOURCE] Đề 1 - Khi Le Chatelier đoán sai.docx
@@ -286,7 +286,7 @@
           <w:b w:val="0"/>
           <w:i/>
         </w:rPr>
-        <w:t>: Thêm khí trơ Ar vào bình cứng (A1) và vào xi-lanh có pít-tông tự do (A2).</w:t>
+        <w:t>: Thêm khí trơ Ar vào bình cứng (A1) và vào xi-lanh có pít-tông tự do (A2). Nguồn: Shutterstock, chỉnh sửa bởi P20 STUDY.</w:t>
       </w:r>
     </w:p>
     <w:p>
@@ -517,7 +517,7 @@
           <w:b w:val="0"/>
           <w:i/>
         </w:rPr>
-        <w:t xml:space="preserve"> trước và sau khi pha loãng gấp đôi.</w:t>
+        <w:t xml:space="preserve"> trước và sau khi pha loãng gấp đôi. Nguồn: P20 STUDY.</w:t>
       </w:r>
     </w:p>
     <w:p>
@@ -2041,7 +2041,7 @@
           <w:b w:val="0"/>
           <w:i w:val="0"/>
         </w:rPr>
-        <w:t>Cân bằng chuyển dịch nhằm mục đích làm thay đổi giá trị Kc của hệ.</w:t>
+        <w:t>Cân bằng chuyển dịch nhằm mục đích làm thay đổi giá trị hằng số cân bằng Kc của hệ.</w:t>
       </w:r>
     </w:p>
     <w:p>
@@ -2098,7 +2098,7 @@
           <w:b w:val="0"/>
           <w:i w:val="0"/>
         </w:rPr>
-        <w:t>Cân bằng chuyển dịch theo chiều thuận khi hệ vừa được thêm một chất đầu bất kỳ.</w:t>
+        <w:t>Cân bằng chuyển dịch theo chiều thuận khi hệ được thêm một chất đầu bất kỳ.</w:t>
       </w:r>
     </w:p>
     <w:p>
@@ -2774,7 +2774,7 @@
           <w:b w:val="0"/>
           <w:i w:val="0"/>
         </w:rPr>
-        <w:t>Q = 100; cân bằng không chuyển dịch.</w:t>
+        <w:t>Q = 100; cân bằng vẫn giữ nguyên, không chuyển dịch.</w:t>
       </w:r>
     </w:p>
     <w:p>
@@ -3643,1006 +3643,6 @@
           <w:color w:val="808080"/>
           <w:sz w:val="20"/>
         </w:rPr>
-        <w:t>Trắc nghiệm 4 lựa chọn | Độ khó 3,5/5 | Mức tư duy 3 | Mô hình hóa &amp; Tỷ lệ | Lỗi khai thác: L2</w:t>
-      </w:r>
-    </w:p>
-    <w:p>
-      <w:pPr>
-        <w:jc w:val="both"/>
-      </w:pPr>
-      <w:r>
-        <w:rPr>
-          <w:b w:val="0"/>
-          <w:i w:val="0"/>
-        </w:rPr>
-        <w:t>Giả sử ở tình huống B, người ta pha loãng dung dịch để thể tích tăng gấp 4 lần thay vì gấp đôi. Q ngay sau tác động bằng</w:t>
-      </w:r>
-    </w:p>
-    <w:p>
-      <w:pPr>
-        <w:jc w:val="left"/>
-      </w:pPr>
-      <w:r>
-        <w:rPr>
-          <w:b w:val="0"/>
-          <w:i w:val="0"/>
-        </w:rPr>
-        <w:t>A. 25.   B. 100.   C. 200.   D. 400.</w:t>
-      </w:r>
-    </w:p>
-    <w:p>
-      <w:pPr>
-        <w:jc w:val="left"/>
-      </w:pPr>
-      <w:r>
-        <w:rPr>
-          <w:b/>
-          <w:i w:val="0"/>
-          <w:color w:val="008000"/>
-        </w:rPr>
-        <w:t xml:space="preserve">▸ Đáp án: </w:t>
-      </w:r>
-      <w:r>
-        <w:rPr>
-          <w:b w:val="0"/>
-          <w:i w:val="0"/>
-          <w:color w:val="008000"/>
-        </w:rPr>
-        <w:t>D</w:t>
-      </w:r>
-    </w:p>
-    <w:p>
-      <w:pPr>
-        <w:jc w:val="left"/>
-      </w:pPr>
-      <w:r>
-        <w:rPr>
-          <w:b/>
-          <w:i w:val="0"/>
-          <w:color w:val="008000"/>
-        </w:rPr>
-        <w:t>▸ Giải thích:</w:t>
-      </w:r>
-    </w:p>
-    <w:p>
-      <w:pPr>
-        <w:ind w:left="340"/>
-        <w:jc w:val="both"/>
-      </w:pPr>
-      <w:r>
-        <w:rPr>
-          <w:b w:val="0"/>
-          <w:i w:val="0"/>
-          <w:color w:val="008000"/>
-        </w:rPr>
-        <w:t>Pha loãng gấp 4 lần thì mọi nồng độ giảm 4 lần: [FeSCN</w:t>
-      </w:r>
-      <w:r>
-        <w:rPr>
-          <w:b w:val="0"/>
-          <w:i w:val="0"/>
-          <w:color w:val="008000"/>
-          <w:vertAlign w:val="superscript"/>
-        </w:rPr>
-        <w:t>2+</w:t>
-      </w:r>
-      <w:r>
-        <w:rPr>
-          <w:b w:val="0"/>
-          <w:i w:val="0"/>
-          <w:color w:val="008000"/>
-        </w:rPr>
-        <w:t>] = 0,040/4 = 0,010 M; [Fe</w:t>
-      </w:r>
-      <w:r>
-        <w:rPr>
-          <w:b w:val="0"/>
-          <w:i w:val="0"/>
-          <w:color w:val="008000"/>
-          <w:vertAlign w:val="superscript"/>
-        </w:rPr>
-        <w:t>3+</w:t>
-      </w:r>
-      <w:r>
-        <w:rPr>
-          <w:b w:val="0"/>
-          <w:i w:val="0"/>
-          <w:color w:val="008000"/>
-        </w:rPr>
-        <w:t>] = [SCN</w:t>
-      </w:r>
-      <w:r>
-        <w:rPr>
-          <w:b w:val="0"/>
-          <w:i w:val="0"/>
-          <w:color w:val="008000"/>
-          <w:vertAlign w:val="superscript"/>
-        </w:rPr>
-        <w:t>-</w:t>
-      </w:r>
-      <w:r>
-        <w:rPr>
-          <w:b w:val="0"/>
-          <w:i w:val="0"/>
-          <w:color w:val="008000"/>
-        </w:rPr>
-        <w:t>] = 0,020/4 = 0,005 M.</w:t>
-      </w:r>
-    </w:p>
-    <w:p>
-      <w:pPr>
-        <w:ind w:left="340"/>
-        <w:jc w:val="both"/>
-      </w:pPr>
-      <w:r>
-        <w:rPr>
-          <w:b w:val="0"/>
-          <w:i w:val="0"/>
-          <w:color w:val="008000"/>
-        </w:rPr>
-        <w:t>Q = 0,010/(0,005 × 0,005) = 400. Vậy D đúng.</w:t>
-      </w:r>
-    </w:p>
-    <w:p>
-      <w:pPr>
-        <w:ind w:left="340"/>
-        <w:jc w:val="both"/>
-      </w:pPr>
-      <w:r>
-        <w:rPr>
-          <w:b w:val="0"/>
-          <w:i w:val="0"/>
-          <w:color w:val="008000"/>
-        </w:rPr>
-        <w:t>A sai: lấy Kc chia 4.</w:t>
-      </w:r>
-    </w:p>
-    <w:p>
-      <w:pPr>
-        <w:ind w:left="340"/>
-        <w:jc w:val="both"/>
-      </w:pPr>
-      <w:r>
-        <w:rPr>
-          <w:b w:val="0"/>
-          <w:i w:val="0"/>
-          <w:color w:val="008000"/>
-        </w:rPr>
-        <w:t>B sai: cho rằng pha loãng không làm Q thay đổi (L2).</w:t>
-      </w:r>
-    </w:p>
-    <w:p>
-      <w:pPr>
-        <w:ind w:left="340"/>
-        <w:jc w:val="both"/>
-      </w:pPr>
-      <w:r>
-        <w:rPr>
-          <w:b w:val="0"/>
-          <w:i w:val="0"/>
-          <w:color w:val="008000"/>
-        </w:rPr>
-        <w:t>C sai: đó là Q khi pha loãng gấp đôi.</w:t>
-      </w:r>
-    </w:p>
-    <w:p>
-      <w:pPr>
-        <w:jc w:val="left"/>
-      </w:pPr>
-      <w:r>
-        <w:rPr>
-          <w:b/>
-          <w:i w:val="0"/>
-          <w:color w:val="FF8000"/>
-        </w:rPr>
-        <w:t>Câu 6. [P20 STUDY]</w:t>
-      </w:r>
-    </w:p>
-    <w:p>
-      <w:pPr>
-        <w:jc w:val="left"/>
-      </w:pPr>
-      <w:r>
-        <w:rPr>
-          <w:b w:val="0"/>
-          <w:i/>
-          <w:color w:val="808080"/>
-          <w:sz w:val="20"/>
-        </w:rPr>
-        <w:t>Điền khuyết | Độ khó 3,5/5 | Mức tư duy 3 | Phân tích dữ liệu chéo | Lỗi khai thác: L4</w:t>
-      </w:r>
-    </w:p>
-    <w:p>
-      <w:pPr>
-        <w:jc w:val="both"/>
-      </w:pPr>
-      <w:r>
-        <w:rPr>
-          <w:b w:val="0"/>
-          <w:i w:val="0"/>
-        </w:rPr>
-        <w:t>Điền số (làm tròn đến ba chữ số sau dấu phẩy) vào chỗ trống:</w:t>
-      </w:r>
-    </w:p>
-    <w:p>
-      <w:pPr>
-        <w:jc w:val="both"/>
-      </w:pPr>
-      <w:r>
-        <w:rPr>
-          <w:b w:val="0"/>
-          <w:i w:val="0"/>
-        </w:rPr>
-        <w:t>Ở tình huống A2, giả sử thay vì thêm Ar, người ta bơm thêm khí N</w:t>
-      </w:r>
-      <w:r>
-        <w:rPr>
-          <w:b w:val="0"/>
-          <w:i w:val="0"/>
-          <w:vertAlign w:val="subscript"/>
-        </w:rPr>
-        <w:t>2</w:t>
-      </w:r>
-      <w:r>
-        <w:rPr>
-          <w:b w:val="0"/>
-          <w:i w:val="0"/>
-        </w:rPr>
-        <w:t>O</w:t>
-      </w:r>
-      <w:r>
-        <w:rPr>
-          <w:b w:val="0"/>
-          <w:i w:val="0"/>
-          <w:vertAlign w:val="subscript"/>
-        </w:rPr>
-        <w:t>4</w:t>
-      </w:r>
-      <w:r>
-        <w:rPr>
-          <w:b w:val="0"/>
-          <w:i w:val="0"/>
-        </w:rPr>
-        <w:t xml:space="preserve"> với số mol đúng bằng số mol Ar đã dùng; áp suất tổng và nhiệt độ giữ không đổi. Q ngay sau tác động bằng ______.</w:t>
-      </w:r>
-    </w:p>
-    <w:p>
-      <w:pPr>
-        <w:jc w:val="left"/>
-      </w:pPr>
-      <w:r>
-        <w:rPr>
-          <w:b/>
-          <w:i w:val="0"/>
-          <w:color w:val="008000"/>
-        </w:rPr>
-        <w:t xml:space="preserve">▸ Đáp án: </w:t>
-      </w:r>
-      <w:r>
-        <w:rPr>
-          <w:b w:val="0"/>
-          <w:i w:val="0"/>
-          <w:color w:val="008000"/>
-        </w:rPr>
-        <w:t>0,007</w:t>
-      </w:r>
-    </w:p>
-    <w:p>
-      <w:pPr>
-        <w:jc w:val="left"/>
-      </w:pPr>
-      <w:r>
-        <w:rPr>
-          <w:b/>
-          <w:i w:val="0"/>
-          <w:color w:val="008000"/>
-        </w:rPr>
-        <w:t>▸ Giải thích:</w:t>
-      </w:r>
-    </w:p>
-    <w:p>
-      <w:pPr>
-        <w:ind w:left="340"/>
-        <w:jc w:val="both"/>
-      </w:pPr>
-      <w:r>
-        <w:rPr>
-          <w:b w:val="0"/>
-          <w:i w:val="0"/>
-          <w:color w:val="008000"/>
-        </w:rPr>
-        <w:t>Lượng Ar ở A2 làm thể tích tăng gấp đôi nên số mol Ar bằng tổng số mol khí ban đầu: 0,100V + 0,060V = 0,160V (mol).</w:t>
-      </w:r>
-    </w:p>
-    <w:p>
-      <w:pPr>
-        <w:ind w:left="340"/>
-        <w:jc w:val="both"/>
-      </w:pPr>
-      <w:r>
-        <w:rPr>
-          <w:b w:val="0"/>
-          <w:i w:val="0"/>
-          <w:color w:val="008000"/>
-        </w:rPr>
-        <w:t>Bơm 0,160V mol N</w:t>
-      </w:r>
-      <w:r>
-        <w:rPr>
-          <w:b w:val="0"/>
-          <w:i w:val="0"/>
-          <w:color w:val="008000"/>
-          <w:vertAlign w:val="subscript"/>
-        </w:rPr>
-        <w:t>2</w:t>
-      </w:r>
-      <w:r>
-        <w:rPr>
-          <w:b w:val="0"/>
-          <w:i w:val="0"/>
-          <w:color w:val="008000"/>
-        </w:rPr>
-        <w:t>O</w:t>
-      </w:r>
-      <w:r>
-        <w:rPr>
-          <w:b w:val="0"/>
-          <w:i w:val="0"/>
-          <w:color w:val="008000"/>
-          <w:vertAlign w:val="subscript"/>
-        </w:rPr>
-        <w:t>4</w:t>
-      </w:r>
-      <w:r>
-        <w:rPr>
-          <w:b w:val="0"/>
-          <w:i w:val="0"/>
-          <w:color w:val="008000"/>
-        </w:rPr>
-        <w:t xml:space="preserve"> thì thể tích thành 2V.</w:t>
-      </w:r>
-    </w:p>
-    <w:p>
-      <w:pPr>
-        <w:ind w:left="340"/>
-        <w:jc w:val="both"/>
-      </w:pPr>
-      <w:r>
-        <w:rPr>
-          <w:b w:val="0"/>
-          <w:i w:val="0"/>
-          <w:color w:val="008000"/>
-        </w:rPr>
-        <w:t>[N</w:t>
-      </w:r>
-      <w:r>
-        <w:rPr>
-          <w:b w:val="0"/>
-          <w:i w:val="0"/>
-          <w:color w:val="008000"/>
-          <w:vertAlign w:val="subscript"/>
-        </w:rPr>
-        <w:t>2</w:t>
-      </w:r>
-      <w:r>
-        <w:rPr>
-          <w:b w:val="0"/>
-          <w:i w:val="0"/>
-          <w:color w:val="008000"/>
-        </w:rPr>
-        <w:t>O</w:t>
-      </w:r>
-      <w:r>
-        <w:rPr>
-          <w:b w:val="0"/>
-          <w:i w:val="0"/>
-          <w:color w:val="008000"/>
-          <w:vertAlign w:val="subscript"/>
-        </w:rPr>
-        <w:t>4</w:t>
-      </w:r>
-      <w:r>
-        <w:rPr>
-          <w:b w:val="0"/>
-          <w:i w:val="0"/>
-          <w:color w:val="008000"/>
-        </w:rPr>
-        <w:t>] = (0,100V + 0,160V)/2V = 0,130 M; [NO</w:t>
-      </w:r>
-      <w:r>
-        <w:rPr>
-          <w:b w:val="0"/>
-          <w:i w:val="0"/>
-          <w:color w:val="008000"/>
-          <w:vertAlign w:val="subscript"/>
-        </w:rPr>
-        <w:t>2</w:t>
-      </w:r>
-      <w:r>
-        <w:rPr>
-          <w:b w:val="0"/>
-          <w:i w:val="0"/>
-          <w:color w:val="008000"/>
-        </w:rPr>
-        <w:t>] = 0,060V/2V = 0,030 M.</w:t>
-      </w:r>
-    </w:p>
-    <w:p>
-      <w:pPr>
-        <w:ind w:left="340"/>
-        <w:jc w:val="both"/>
-      </w:pPr>
-      <w:r>
-        <w:rPr>
-          <w:b w:val="0"/>
-          <w:i w:val="0"/>
-          <w:color w:val="008000"/>
-        </w:rPr>
-        <w:t>Q = 0,030</w:t>
-      </w:r>
-      <w:r>
-        <w:rPr>
-          <w:b w:val="0"/>
-          <w:i w:val="0"/>
-          <w:color w:val="008000"/>
-          <w:vertAlign w:val="superscript"/>
-        </w:rPr>
-        <w:t>2</w:t>
-      </w:r>
-      <w:r>
-        <w:rPr>
-          <w:b w:val="0"/>
-          <w:i w:val="0"/>
-          <w:color w:val="008000"/>
-        </w:rPr>
-        <w:t>/0,130 ≈ 0,0069, làm tròn 0,007.</w:t>
-      </w:r>
-    </w:p>
-    <w:p>
-      <w:pPr>
-        <w:ind w:left="340"/>
-        <w:jc w:val="both"/>
-      </w:pPr>
-      <w:r>
-        <w:rPr>
-          <w:b w:val="0"/>
-          <w:i w:val="0"/>
-          <w:color w:val="008000"/>
-        </w:rPr>
-        <w:t>Q &lt; Kc = 0,036 nên cân bằng vẫn chuyển dịch theo chiều thuận dù vừa thêm N</w:t>
-      </w:r>
-      <w:r>
-        <w:rPr>
-          <w:b w:val="0"/>
-          <w:i w:val="0"/>
-          <w:color w:val="008000"/>
-          <w:vertAlign w:val="subscript"/>
-        </w:rPr>
-        <w:t>2</w:t>
-      </w:r>
-      <w:r>
-        <w:rPr>
-          <w:b w:val="0"/>
-          <w:i w:val="0"/>
-          <w:color w:val="008000"/>
-        </w:rPr>
-        <w:t>O</w:t>
-      </w:r>
-      <w:r>
-        <w:rPr>
-          <w:b w:val="0"/>
-          <w:i w:val="0"/>
-          <w:color w:val="008000"/>
-          <w:vertAlign w:val="subscript"/>
-        </w:rPr>
-        <w:t>4</w:t>
-      </w:r>
-      <w:r>
-        <w:rPr>
-          <w:b w:val="0"/>
-          <w:i w:val="0"/>
-          <w:color w:val="008000"/>
-        </w:rPr>
-        <w:t>.</w:t>
-      </w:r>
-    </w:p>
-    <w:p>
-      <w:pPr>
-        <w:jc w:val="left"/>
-      </w:pPr>
-      <w:r>
-        <w:rPr>
-          <w:b/>
-          <w:i w:val="0"/>
-          <w:color w:val="FF8000"/>
-        </w:rPr>
-        <w:t>Câu 7. [P20 STUDY]</w:t>
-      </w:r>
-    </w:p>
-    <w:p>
-      <w:pPr>
-        <w:jc w:val="left"/>
-      </w:pPr>
-      <w:r>
-        <w:rPr>
-          <w:b w:val="0"/>
-          <w:i/>
-          <w:color w:val="808080"/>
-          <w:sz w:val="20"/>
-        </w:rPr>
-        <w:t>Ghép đôi | Độ khó 3,5/5 | Mức tư duy 3 | Mô hình hóa &amp; Tỷ lệ | Lỗi khai thác: L2, L4, L5</w:t>
-      </w:r>
-    </w:p>
-    <w:p>
-      <w:pPr>
-        <w:jc w:val="both"/>
-      </w:pPr>
-      <w:r>
-        <w:rPr>
-          <w:b w:val="0"/>
-          <w:i w:val="0"/>
-        </w:rPr>
-        <w:t>Ghép mỗi ý ở Cột A với một ý ở Cột B.</w:t>
-      </w:r>
-    </w:p>
-    <w:tbl>
-      <w:tblPr>
-        <w:tblStyle w:val="TableGrid"/>
-        <w:tblW w:type="auto" w:w="0"/>
-        <w:jc w:val="center"/>
-        <w:tblLayout w:type="fixed"/>
-        <w:tblLook w:firstColumn="1" w:firstRow="1" w:lastColumn="0" w:lastRow="0" w:noHBand="0" w:noVBand="1" w:val="04A0"/>
-      </w:tblPr>
-      <w:tblGrid>
-        <w:gridCol w:w="4819"/>
-        <w:gridCol w:w="4819"/>
-      </w:tblGrid>
-      <w:tr>
-        <w:tc>
-          <w:tcPr>
-            <w:tcW w:type="dxa" w:w="4819"/>
-          </w:tcPr>
-          <w:p>
-            <w:pPr>
-              <w:jc w:val="center"/>
-            </w:pPr>
-            <w:r>
-              <w:rPr>
-                <w:b/>
-                <w:i w:val="0"/>
-              </w:rPr>
-              <w:t>Cột A (tác động)</w:t>
-            </w:r>
-          </w:p>
-        </w:tc>
-        <w:tc>
-          <w:tcPr>
-            <w:tcW w:type="dxa" w:w="4819"/>
-          </w:tcPr>
-          <w:p>
-            <w:pPr>
-              <w:jc w:val="center"/>
-            </w:pPr>
-            <w:r>
-              <w:rPr>
-                <w:b/>
-                <w:i w:val="0"/>
-              </w:rPr>
-              <w:t>Cột B (Q và Kc ngay sau tác động)</w:t>
-            </w:r>
-          </w:p>
-        </w:tc>
-      </w:tr>
-      <w:tr>
-        <w:tc>
-          <w:tcPr>
-            <w:tcW w:type="dxa" w:w="4819"/>
-          </w:tcPr>
-          <w:p>
-            <w:pPr>
-              <w:jc w:val="left"/>
-            </w:pPr>
-            <w:r>
-              <w:rPr>
-                <w:b w:val="0"/>
-                <w:i w:val="0"/>
-              </w:rPr>
-              <w:t>1. Thêm Ar vào bình cứng (A1)</w:t>
-            </w:r>
-          </w:p>
-        </w:tc>
-        <w:tc>
-          <w:tcPr>
-            <w:tcW w:type="dxa" w:w="4819"/>
-          </w:tcPr>
-          <w:p>
-            <w:pPr>
-              <w:jc w:val="left"/>
-            </w:pPr>
-            <w:r>
-              <w:rPr>
-                <w:b w:val="0"/>
-                <w:i w:val="0"/>
-              </w:rPr>
-              <w:t>a. Q giữ nguyên nhưng Kc thay đổi nên Q khác Kc.</w:t>
-            </w:r>
-          </w:p>
-        </w:tc>
-      </w:tr>
-      <w:tr>
-        <w:tc>
-          <w:tcPr>
-            <w:tcW w:type="dxa" w:w="4819"/>
-          </w:tcPr>
-          <w:p>
-            <w:pPr>
-              <w:jc w:val="left"/>
-            </w:pPr>
-            <w:r>
-              <w:rPr>
-                <w:b w:val="0"/>
-                <w:i w:val="0"/>
-              </w:rPr>
-              <w:t>2. Thêm Ar ở áp suất tổng không đổi (A2)</w:t>
-            </w:r>
-          </w:p>
-        </w:tc>
-        <w:tc>
-          <w:tcPr>
-            <w:tcW w:type="dxa" w:w="4819"/>
-          </w:tcPr>
-          <w:p>
-            <w:pPr>
-              <w:jc w:val="left"/>
-            </w:pPr>
-            <w:r>
-              <w:rPr>
-                <w:b w:val="0"/>
-                <w:i w:val="0"/>
-              </w:rPr>
-              <w:t>b. Q giảm do tử số giảm theo bậc hai, mẫu số giảm theo bậc một.</w:t>
-            </w:r>
-          </w:p>
-        </w:tc>
-      </w:tr>
-      <w:tr>
-        <w:tc>
-          <w:tcPr>
-            <w:tcW w:type="dxa" w:w="4819"/>
-          </w:tcPr>
-          <w:p>
-            <w:pPr>
-              <w:jc w:val="left"/>
-            </w:pPr>
-            <w:r>
-              <w:rPr>
-                <w:b w:val="0"/>
-                <w:i w:val="0"/>
-              </w:rPr>
-              <w:t>3. Tăng nhiệt độ hỗn hợp ở tình huống A, giữ nguyên thể tích</w:t>
-            </w:r>
-          </w:p>
-        </w:tc>
-        <w:tc>
-          <w:tcPr>
-            <w:tcW w:type="dxa" w:w="4819"/>
-          </w:tcPr>
-          <w:p>
-            <w:pPr>
-              <w:jc w:val="left"/>
-            </w:pPr>
-            <w:r>
-              <w:rPr>
-                <w:b w:val="0"/>
-                <w:i w:val="0"/>
-              </w:rPr>
-              <w:t>c. Q không đổi do chất vừa thêm không có mặt trong biểu thức.</w:t>
-            </w:r>
-          </w:p>
-        </w:tc>
-      </w:tr>
-      <w:tr>
-        <w:tc>
-          <w:tcPr>
-            <w:tcW w:type="dxa" w:w="4819"/>
-          </w:tcPr>
-          <w:p>
-            <w:pPr>
-              <w:jc w:val="left"/>
-            </w:pPr>
-            <w:r>
-              <w:rPr>
-                <w:b w:val="0"/>
-                <w:i w:val="0"/>
-              </w:rPr>
-              <w:t>4. Thêm NH</w:t>
-            </w:r>
-            <w:r>
-              <w:rPr>
-                <w:b w:val="0"/>
-                <w:i w:val="0"/>
-                <w:vertAlign w:val="subscript"/>
-              </w:rPr>
-              <w:t>4</w:t>
-            </w:r>
-            <w:r>
-              <w:rPr>
-                <w:b w:val="0"/>
-                <w:i w:val="0"/>
-              </w:rPr>
-              <w:t>HS rắn (C)</w:t>
-            </w:r>
-          </w:p>
-        </w:tc>
-        <w:tc>
-          <w:tcPr>
-            <w:tcW w:type="dxa" w:w="4819"/>
-          </w:tcPr>
-          <w:p>
-            <w:pPr>
-              <w:jc w:val="left"/>
-            </w:pPr>
-            <w:r>
-              <w:rPr>
-                <w:b w:val="0"/>
-                <w:i w:val="0"/>
-              </w:rPr>
-              <w:t>d. Q không đổi do nồng độ các chất trong biểu thức đều giữ nguyên.</w:t>
-            </w:r>
-          </w:p>
-        </w:tc>
-      </w:tr>
-    </w:tbl>
-    <w:p>
-      <w:pPr>
-        <w:jc w:val="left"/>
-      </w:pPr>
-      <w:r>
-        <w:rPr>
-          <w:b/>
-          <w:i w:val="0"/>
-          <w:color w:val="008000"/>
-        </w:rPr>
-        <w:t xml:space="preserve">▸ Đáp án: </w:t>
-      </w:r>
-      <w:r>
-        <w:rPr>
-          <w:b w:val="0"/>
-          <w:i w:val="0"/>
-          <w:color w:val="008000"/>
-        </w:rPr>
-        <w:t>1-d; 2-b; 3-a; 4-c</w:t>
-      </w:r>
-    </w:p>
-    <w:p>
-      <w:pPr>
-        <w:jc w:val="left"/>
-      </w:pPr>
-      <w:r>
-        <w:rPr>
-          <w:b/>
-          <w:i w:val="0"/>
-          <w:color w:val="008000"/>
-        </w:rPr>
-        <w:t>▸ Giải thích:</w:t>
-      </w:r>
-    </w:p>
-    <w:p>
-      <w:pPr>
-        <w:ind w:left="340"/>
-        <w:jc w:val="both"/>
-      </w:pPr>
-      <w:r>
-        <w:rPr>
-          <w:b w:val="0"/>
-          <w:i w:val="0"/>
-          <w:color w:val="008000"/>
-        </w:rPr>
-        <w:t>1-d: thể tích cố định nên nồng độ N</w:t>
-      </w:r>
-      <w:r>
-        <w:rPr>
-          <w:b w:val="0"/>
-          <w:i w:val="0"/>
-          <w:color w:val="008000"/>
-          <w:vertAlign w:val="subscript"/>
-        </w:rPr>
-        <w:t>2</w:t>
-      </w:r>
-      <w:r>
-        <w:rPr>
-          <w:b w:val="0"/>
-          <w:i w:val="0"/>
-          <w:color w:val="008000"/>
-        </w:rPr>
-        <w:t>O</w:t>
-      </w:r>
-      <w:r>
-        <w:rPr>
-          <w:b w:val="0"/>
-          <w:i w:val="0"/>
-          <w:color w:val="008000"/>
-          <w:vertAlign w:val="subscript"/>
-        </w:rPr>
-        <w:t>4</w:t>
-      </w:r>
-      <w:r>
-        <w:rPr>
-          <w:b w:val="0"/>
-          <w:i w:val="0"/>
-          <w:color w:val="008000"/>
-        </w:rPr>
-        <w:t xml:space="preserve"> và NO</w:t>
-      </w:r>
-      <w:r>
-        <w:rPr>
-          <w:b w:val="0"/>
-          <w:i w:val="0"/>
-          <w:color w:val="008000"/>
-          <w:vertAlign w:val="subscript"/>
-        </w:rPr>
-        <w:t>2</w:t>
-      </w:r>
-      <w:r>
-        <w:rPr>
-          <w:b w:val="0"/>
-          <w:i w:val="0"/>
-          <w:color w:val="008000"/>
-        </w:rPr>
-        <w:t xml:space="preserve"> giữ nguyên, Q không đổi.</w:t>
-      </w:r>
-    </w:p>
-    <w:p>
-      <w:pPr>
-        <w:ind w:left="340"/>
-        <w:jc w:val="both"/>
-      </w:pPr>
-      <w:r>
-        <w:rPr>
-          <w:b w:val="0"/>
-          <w:i w:val="0"/>
-          <w:color w:val="008000"/>
-        </w:rPr>
-        <w:t>2-b: thể tích gấp đôi làm [NO</w:t>
-      </w:r>
-      <w:r>
-        <w:rPr>
-          <w:b w:val="0"/>
-          <w:i w:val="0"/>
-          <w:color w:val="008000"/>
-          <w:vertAlign w:val="subscript"/>
-        </w:rPr>
-        <w:t>2</w:t>
-      </w:r>
-      <w:r>
-        <w:rPr>
-          <w:b w:val="0"/>
-          <w:i w:val="0"/>
-          <w:color w:val="008000"/>
-        </w:rPr>
-        <w:t>]</w:t>
-      </w:r>
-      <w:r>
-        <w:rPr>
-          <w:b w:val="0"/>
-          <w:i w:val="0"/>
-          <w:color w:val="008000"/>
-          <w:vertAlign w:val="superscript"/>
-        </w:rPr>
-        <w:t>2</w:t>
-      </w:r>
-      <w:r>
-        <w:rPr>
-          <w:b w:val="0"/>
-          <w:i w:val="0"/>
-          <w:color w:val="008000"/>
-        </w:rPr>
-        <w:t xml:space="preserve"> giảm 4 lần còn [N</w:t>
-      </w:r>
-      <w:r>
-        <w:rPr>
-          <w:b w:val="0"/>
-          <w:i w:val="0"/>
-          <w:color w:val="008000"/>
-          <w:vertAlign w:val="subscript"/>
-        </w:rPr>
-        <w:t>2</w:t>
-      </w:r>
-      <w:r>
-        <w:rPr>
-          <w:b w:val="0"/>
-          <w:i w:val="0"/>
-          <w:color w:val="008000"/>
-        </w:rPr>
-        <w:t>O</w:t>
-      </w:r>
-      <w:r>
-        <w:rPr>
-          <w:b w:val="0"/>
-          <w:i w:val="0"/>
-          <w:color w:val="008000"/>
-          <w:vertAlign w:val="subscript"/>
-        </w:rPr>
-        <w:t>4</w:t>
-      </w:r>
-      <w:r>
-        <w:rPr>
-          <w:b w:val="0"/>
-          <w:i w:val="0"/>
-          <w:color w:val="008000"/>
-        </w:rPr>
-        <w:t>] giảm 2 lần, nên Q giảm một nửa.</w:t>
-      </w:r>
-    </w:p>
-    <w:p>
-      <w:pPr>
-        <w:ind w:left="340"/>
-        <w:jc w:val="both"/>
-      </w:pPr>
-      <w:r>
-        <w:rPr>
-          <w:b w:val="0"/>
-          <w:i w:val="0"/>
-          <w:color w:val="008000"/>
-        </w:rPr>
-        <w:t>3-a: nồng độ chưa đổi nên Q giữ nguyên, nhưng nhiệt độ là yếu tố duy nhất làm Kc thay đổi.</w:t>
-      </w:r>
-    </w:p>
-    <w:p>
-      <w:pPr>
-        <w:ind w:left="340"/>
-        <w:jc w:val="both"/>
-      </w:pPr>
-      <w:r>
-        <w:rPr>
-          <w:b w:val="0"/>
-          <w:i w:val="0"/>
-          <w:color w:val="008000"/>
-        </w:rPr>
-        <w:t>4-c: NH</w:t>
-      </w:r>
-      <w:r>
-        <w:rPr>
-          <w:b w:val="0"/>
-          <w:i w:val="0"/>
-          <w:color w:val="008000"/>
-          <w:vertAlign w:val="subscript"/>
-        </w:rPr>
-        <w:t>4</w:t>
-      </w:r>
-      <w:r>
-        <w:rPr>
-          <w:b w:val="0"/>
-          <w:i w:val="0"/>
-          <w:color w:val="008000"/>
-        </w:rPr>
-        <w:t>HS là chất rắn, không có mặt trong biểu thức Q.</w:t>
-      </w:r>
-    </w:p>
-    <w:p>
-      <w:pPr>
-        <w:jc w:val="left"/>
-      </w:pPr>
-      <w:r>
-        <w:rPr>
-          <w:b/>
-          <w:i w:val="0"/>
-          <w:color w:val="FF8000"/>
-        </w:rPr>
-        <w:t>Câu 8. [P20 STUDY]</w:t>
-      </w:r>
-    </w:p>
-    <w:p>
-      <w:pPr>
-        <w:jc w:val="left"/>
-      </w:pPr>
-      <w:r>
-        <w:rPr>
-          <w:b w:val="0"/>
-          <w:i/>
-          <w:color w:val="808080"/>
-          <w:sz w:val="20"/>
-        </w:rPr>
         <w:t>Ghép đôi | Độ khó 4,0/5 | Mức tư duy 4 | Chẩn đoán &amp; Khắc phục | Lỗi khai thác: L1, L2, L3, L4</w:t>
       </w:r>
     </w:p>
@@ -4737,7 +3737,7 @@
                 <w:b w:val="0"/>
                 <w:i w:val="0"/>
               </w:rPr>
-              <w:t>a. Bỏ qua số mũ và số chất ở tử số, mẫu số của biểu thức Q.</w:t>
+              <w:t>a. Bỏ qua sự khác nhau về số mũ và số lượng nồng độ ở tử số, mẫu số của biểu thức Q.</w:t>
             </w:r>
           </w:p>
         </w:tc>
@@ -5002,7 +4002,7 @@
           <w:i w:val="0"/>
           <w:color w:val="FF8000"/>
         </w:rPr>
-        <w:t>Câu 9. [P20 STUDY]</w:t>
+        <w:t>Câu 6. [P20 STUDY]</w:t>
       </w:r>
     </w:p>
     <w:p>
@@ -5763,369 +4763,6 @@
                 <w:b w:val="0"/>
                 <w:i w:val="0"/>
               </w:rPr>
-              <w:t>Trắc nghiệm 4 lựa chọn</w:t>
-            </w:r>
-          </w:p>
-        </w:tc>
-        <w:tc>
-          <w:tcPr>
-            <w:tcW w:type="dxa" w:w="1377"/>
-          </w:tcPr>
-          <w:p>
-            <w:pPr>
-              <w:jc w:val="center"/>
-            </w:pPr>
-            <w:r>
-              <w:rPr>
-                <w:b w:val="0"/>
-                <w:i w:val="0"/>
-              </w:rPr>
-              <w:t>3,5/5</w:t>
-            </w:r>
-          </w:p>
-        </w:tc>
-        <w:tc>
-          <w:tcPr>
-            <w:tcW w:type="dxa" w:w="1377"/>
-          </w:tcPr>
-          <w:p>
-            <w:pPr>
-              <w:jc w:val="center"/>
-            </w:pPr>
-            <w:r>
-              <w:rPr>
-                <w:b w:val="0"/>
-                <w:i w:val="0"/>
-              </w:rPr>
-              <w:t>3</w:t>
-            </w:r>
-          </w:p>
-        </w:tc>
-        <w:tc>
-          <w:tcPr>
-            <w:tcW w:type="dxa" w:w="1377"/>
-          </w:tcPr>
-          <w:p>
-            <w:pPr>
-              <w:jc w:val="center"/>
-            </w:pPr>
-            <w:r>
-              <w:rPr>
-                <w:b w:val="0"/>
-                <w:i w:val="0"/>
-              </w:rPr>
-              <w:t>Mô hình hóa &amp; Tỷ lệ</w:t>
-            </w:r>
-          </w:p>
-        </w:tc>
-        <w:tc>
-          <w:tcPr>
-            <w:tcW w:type="dxa" w:w="1377"/>
-          </w:tcPr>
-          <w:p>
-            <w:pPr>
-              <w:jc w:val="center"/>
-            </w:pPr>
-            <w:r>
-              <w:rPr>
-                <w:b w:val="0"/>
-                <w:i w:val="0"/>
-              </w:rPr>
-              <w:t>L2</w:t>
-            </w:r>
-          </w:p>
-        </w:tc>
-        <w:tc>
-          <w:tcPr>
-            <w:tcW w:type="dxa" w:w="1377"/>
-          </w:tcPr>
-          <w:p>
-            <w:pPr>
-              <w:jc w:val="center"/>
-            </w:pPr>
-            <w:r>
-              <w:rPr>
-                <w:b w:val="0"/>
-                <w:i w:val="0"/>
-              </w:rPr>
-              <w:t>D</w:t>
-            </w:r>
-          </w:p>
-        </w:tc>
-      </w:tr>
-      <w:tr>
-        <w:tc>
-          <w:tcPr>
-            <w:tcW w:type="dxa" w:w="1377"/>
-          </w:tcPr>
-          <w:p>
-            <w:pPr>
-              <w:jc w:val="center"/>
-            </w:pPr>
-            <w:r>
-              <w:rPr>
-                <w:b w:val="0"/>
-                <w:i w:val="0"/>
-              </w:rPr>
-              <w:t>6</w:t>
-            </w:r>
-          </w:p>
-        </w:tc>
-        <w:tc>
-          <w:tcPr>
-            <w:tcW w:type="dxa" w:w="1377"/>
-          </w:tcPr>
-          <w:p>
-            <w:pPr>
-              <w:jc w:val="center"/>
-            </w:pPr>
-            <w:r>
-              <w:rPr>
-                <w:b w:val="0"/>
-                <w:i w:val="0"/>
-              </w:rPr>
-              <w:t>Điền khuyết</w:t>
-            </w:r>
-          </w:p>
-        </w:tc>
-        <w:tc>
-          <w:tcPr>
-            <w:tcW w:type="dxa" w:w="1377"/>
-          </w:tcPr>
-          <w:p>
-            <w:pPr>
-              <w:jc w:val="center"/>
-            </w:pPr>
-            <w:r>
-              <w:rPr>
-                <w:b w:val="0"/>
-                <w:i w:val="0"/>
-              </w:rPr>
-              <w:t>3,5/5</w:t>
-            </w:r>
-          </w:p>
-        </w:tc>
-        <w:tc>
-          <w:tcPr>
-            <w:tcW w:type="dxa" w:w="1377"/>
-          </w:tcPr>
-          <w:p>
-            <w:pPr>
-              <w:jc w:val="center"/>
-            </w:pPr>
-            <w:r>
-              <w:rPr>
-                <w:b w:val="0"/>
-                <w:i w:val="0"/>
-              </w:rPr>
-              <w:t>3</w:t>
-            </w:r>
-          </w:p>
-        </w:tc>
-        <w:tc>
-          <w:tcPr>
-            <w:tcW w:type="dxa" w:w="1377"/>
-          </w:tcPr>
-          <w:p>
-            <w:pPr>
-              <w:jc w:val="center"/>
-            </w:pPr>
-            <w:r>
-              <w:rPr>
-                <w:b w:val="0"/>
-                <w:i w:val="0"/>
-              </w:rPr>
-              <w:t>Phân tích dữ liệu chéo</w:t>
-            </w:r>
-          </w:p>
-        </w:tc>
-        <w:tc>
-          <w:tcPr>
-            <w:tcW w:type="dxa" w:w="1377"/>
-          </w:tcPr>
-          <w:p>
-            <w:pPr>
-              <w:jc w:val="center"/>
-            </w:pPr>
-            <w:r>
-              <w:rPr>
-                <w:b w:val="0"/>
-                <w:i w:val="0"/>
-              </w:rPr>
-              <w:t>L4</w:t>
-            </w:r>
-          </w:p>
-        </w:tc>
-        <w:tc>
-          <w:tcPr>
-            <w:tcW w:type="dxa" w:w="1377"/>
-          </w:tcPr>
-          <w:p>
-            <w:pPr>
-              <w:jc w:val="center"/>
-            </w:pPr>
-            <w:r>
-              <w:rPr>
-                <w:b w:val="0"/>
-                <w:i w:val="0"/>
-              </w:rPr>
-              <w:t>0,007</w:t>
-            </w:r>
-          </w:p>
-        </w:tc>
-      </w:tr>
-      <w:tr>
-        <w:tc>
-          <w:tcPr>
-            <w:tcW w:type="dxa" w:w="1377"/>
-          </w:tcPr>
-          <w:p>
-            <w:pPr>
-              <w:jc w:val="center"/>
-            </w:pPr>
-            <w:r>
-              <w:rPr>
-                <w:b w:val="0"/>
-                <w:i w:val="0"/>
-              </w:rPr>
-              <w:t>7</w:t>
-            </w:r>
-          </w:p>
-        </w:tc>
-        <w:tc>
-          <w:tcPr>
-            <w:tcW w:type="dxa" w:w="1377"/>
-          </w:tcPr>
-          <w:p>
-            <w:pPr>
-              <w:jc w:val="center"/>
-            </w:pPr>
-            <w:r>
-              <w:rPr>
-                <w:b w:val="0"/>
-                <w:i w:val="0"/>
-              </w:rPr>
-              <w:t>Ghép đôi</w:t>
-            </w:r>
-          </w:p>
-        </w:tc>
-        <w:tc>
-          <w:tcPr>
-            <w:tcW w:type="dxa" w:w="1377"/>
-          </w:tcPr>
-          <w:p>
-            <w:pPr>
-              <w:jc w:val="center"/>
-            </w:pPr>
-            <w:r>
-              <w:rPr>
-                <w:b w:val="0"/>
-                <w:i w:val="0"/>
-              </w:rPr>
-              <w:t>3,5/5</w:t>
-            </w:r>
-          </w:p>
-        </w:tc>
-        <w:tc>
-          <w:tcPr>
-            <w:tcW w:type="dxa" w:w="1377"/>
-          </w:tcPr>
-          <w:p>
-            <w:pPr>
-              <w:jc w:val="center"/>
-            </w:pPr>
-            <w:r>
-              <w:rPr>
-                <w:b w:val="0"/>
-                <w:i w:val="0"/>
-              </w:rPr>
-              <w:t>3</w:t>
-            </w:r>
-          </w:p>
-        </w:tc>
-        <w:tc>
-          <w:tcPr>
-            <w:tcW w:type="dxa" w:w="1377"/>
-          </w:tcPr>
-          <w:p>
-            <w:pPr>
-              <w:jc w:val="center"/>
-            </w:pPr>
-            <w:r>
-              <w:rPr>
-                <w:b w:val="0"/>
-                <w:i w:val="0"/>
-              </w:rPr>
-              <w:t>Mô hình hóa &amp; Tỷ lệ</w:t>
-            </w:r>
-          </w:p>
-        </w:tc>
-        <w:tc>
-          <w:tcPr>
-            <w:tcW w:type="dxa" w:w="1377"/>
-          </w:tcPr>
-          <w:p>
-            <w:pPr>
-              <w:jc w:val="center"/>
-            </w:pPr>
-            <w:r>
-              <w:rPr>
-                <w:b w:val="0"/>
-                <w:i w:val="0"/>
-              </w:rPr>
-              <w:t>L2, L4, L5</w:t>
-            </w:r>
-          </w:p>
-        </w:tc>
-        <w:tc>
-          <w:tcPr>
-            <w:tcW w:type="dxa" w:w="1377"/>
-          </w:tcPr>
-          <w:p>
-            <w:pPr>
-              <w:jc w:val="center"/>
-            </w:pPr>
-            <w:r>
-              <w:rPr>
-                <w:b w:val="0"/>
-                <w:i w:val="0"/>
-              </w:rPr>
-              <w:t>1-d; 2-b; 3-a; 4-c</w:t>
-            </w:r>
-          </w:p>
-        </w:tc>
-      </w:tr>
-      <w:tr>
-        <w:tc>
-          <w:tcPr>
-            <w:tcW w:type="dxa" w:w="1377"/>
-          </w:tcPr>
-          <w:p>
-            <w:pPr>
-              <w:jc w:val="center"/>
-            </w:pPr>
-            <w:r>
-              <w:rPr>
-                <w:b w:val="0"/>
-                <w:i w:val="0"/>
-              </w:rPr>
-              <w:t>8</w:t>
-            </w:r>
-          </w:p>
-        </w:tc>
-        <w:tc>
-          <w:tcPr>
-            <w:tcW w:type="dxa" w:w="1377"/>
-          </w:tcPr>
-          <w:p>
-            <w:pPr>
-              <w:jc w:val="center"/>
-            </w:pPr>
-            <w:r>
-              <w:rPr>
-                <w:b w:val="0"/>
-                <w:i w:val="0"/>
-              </w:rPr>
               <w:t>Ghép đôi</w:t>
             </w:r>
           </w:p>
@@ -6230,7 +4867,7 @@
                 <w:b w:val="0"/>
                 <w:i w:val="0"/>
               </w:rPr>
-              <w:t>9</w:t>
+              <w:t>6</w:t>
             </w:r>
           </w:p>
         </w:tc>

</xml_diff>

<commit_message>
Đề 1: insert actual images from user's docx into SOURCE
- H1: khí trơ Ar (Shutterstock, translated to Vietnamese)
- H2: FeSCN pha loãng (P20 STUDY self-drawn)
- Extract images from user's uploaded docx, map to correct figure numbers

Co-Authored-By: Claude Opus 4.6 <noreply@anthropic.com>
Claude-Session: https://claude.ai/code/session_01YToDWK6Q41xkdnJbBz9Sbt
</commit_message>
<xml_diff>
--- a/Can bang hoa hoc/Buoi 3/Buổi 3. [SOURCE] Đề 1 - Khi Le Chatelier đoán sai.docx
+++ b/Can bang hoa hoc/Buoi 3/Buổi 3. [SOURCE] Đề 1 - Khi Le Chatelier đoán sai.docx
@@ -262,12 +262,38 @@
         <w:jc w:val="center"/>
       </w:pPr>
       <w:r>
-        <w:rPr>
-          <w:b w:val="0"/>
-          <w:i/>
-          <w:color w:val="808080"/>
-        </w:rPr>
-        <w:t>[Chèn Hình 1]</w:t>
+        <w:drawing>
+          <wp:inline xmlns:a="http://schemas.openxmlformats.org/drawingml/2006/main" xmlns:pic="http://schemas.openxmlformats.org/drawingml/2006/picture">
+            <wp:extent cx="4680000" cy="2355073"/>
+            <wp:docPr id="1" name="Picture 1"/>
+            <wp:cNvGraphicFramePr>
+              <a:graphicFrameLocks noChangeAspect="1"/>
+            </wp:cNvGraphicFramePr>
+            <a:graphic>
+              <a:graphicData uri="http://schemas.openxmlformats.org/drawingml/2006/picture">
+                <pic:pic>
+                  <pic:nvPicPr>
+                    <pic:cNvPr id="0" name="de1_hinh2.png"/>
+                    <pic:cNvPicPr/>
+                  </pic:nvPicPr>
+                  <pic:blipFill>
+                    <a:blip r:embed="rId9"/>
+                    <a:stretch>
+                      <a:fillRect/>
+                    </a:stretch>
+                  </pic:blipFill>
+                  <pic:spPr>
+                    <a:xfrm>
+                      <a:off x="0" y="0"/>
+                      <a:ext cx="4680000" cy="2355073"/>
+                    </a:xfrm>
+                    <a:prstGeom prst="rect"/>
+                  </pic:spPr>
+                </pic:pic>
+              </a:graphicData>
+            </a:graphic>
+          </wp:inline>
+        </w:drawing>
       </w:r>
     </w:p>
     <w:p>
@@ -478,12 +504,38 @@
         <w:jc w:val="center"/>
       </w:pPr>
       <w:r>
-        <w:rPr>
-          <w:b w:val="0"/>
-          <w:i/>
-          <w:color w:val="808080"/>
-        </w:rPr>
-        <w:t>[Chèn Hình 2]</w:t>
+        <w:drawing>
+          <wp:inline xmlns:a="http://schemas.openxmlformats.org/drawingml/2006/main" xmlns:pic="http://schemas.openxmlformats.org/drawingml/2006/picture">
+            <wp:extent cx="4680000" cy="2607989"/>
+            <wp:docPr id="2" name="Picture 2"/>
+            <wp:cNvGraphicFramePr>
+              <a:graphicFrameLocks noChangeAspect="1"/>
+            </wp:cNvGraphicFramePr>
+            <a:graphic>
+              <a:graphicData uri="http://schemas.openxmlformats.org/drawingml/2006/picture">
+                <pic:pic>
+                  <pic:nvPicPr>
+                    <pic:cNvPr id="0" name="de1_hinh1.png"/>
+                    <pic:cNvPicPr/>
+                  </pic:nvPicPr>
+                  <pic:blipFill>
+                    <a:blip r:embed="rId10"/>
+                    <a:stretch>
+                      <a:fillRect/>
+                    </a:stretch>
+                  </pic:blipFill>
+                  <pic:spPr>
+                    <a:xfrm>
+                      <a:off x="0" y="0"/>
+                      <a:ext cx="4680000" cy="2607989"/>
+                    </a:xfrm>
+                    <a:prstGeom prst="rect"/>
+                  </pic:spPr>
+                </pic:pic>
+              </a:graphicData>
+            </a:graphic>
+          </wp:inline>
+        </w:drawing>
       </w:r>
     </w:p>
     <w:p>

</xml_diff>